<commit_message>
ESG: restructure with CFA beta 4.1 (text, E1/E3 with peers, E6 savings-to-price waterfall from ESG_Ahorros, ESG risk matrix S5 and executive track record in Annex Y, ETF flows); consolidated report regenerated
Co-Authored-By: Claude Sonnet 5.5 <noreply@anthropic.com>
Claude-Session: https://claude.ai/code/session_0188QZHBkA8n5QL7BtmFakQg
</commit_message>
<xml_diff>
--- a/secciones/esg/anexo/Mallplaza_ESG_EN_Anexo.docx
+++ b/secciones/esg/anexo/Mallplaza_ESG_EN_Anexo.docx
@@ -374,7 +374,7 @@
                 <w:sz w:val="14"/>
                 <w:szCs w:val="14"/>
               </w:rPr>
-              <w:t xml:space="preserve">53.05%</w:t>
+              <w:t xml:space="preserve">53.10%</w:t>
             </w:r>
           </w:p>
         </w:tc>
@@ -1614,7 +1614,7 @@
                 <w:sz w:val="14"/>
                 <w:szCs w:val="14"/>
               </w:rPr>
-              <w:t xml:space="preserve">Breaches of laws and regulations</w:t>
+              <w:t xml:space="preserve">Corruption</w:t>
             </w:r>
           </w:p>
         </w:tc>
@@ -1688,7 +1688,7 @@
                 <w:sz w:val="14"/>
                 <w:szCs w:val="14"/>
               </w:rPr>
-              <w:t xml:space="preserve">Corruption</w:t>
+              <w:t xml:space="preserve">Breaches of customer rights (Consumer Protection Law 19,496)</w:t>
             </w:r>
           </w:p>
         </w:tc>
@@ -1724,7 +1724,7 @@
                 <w:sz w:val="14"/>
                 <w:szCs w:val="14"/>
               </w:rPr>
-              <w:t xml:space="preserve">0</w:t>
+              <w:t xml:space="preserve">27</w:t>
             </w:r>
           </w:p>
         </w:tc>
@@ -1762,7 +1762,7 @@
                 <w:sz w:val="14"/>
                 <w:szCs w:val="14"/>
               </w:rPr>
-              <w:t xml:space="preserve">Breaches of customer rights (Consumer Protection Law 19,496)</w:t>
+              <w:t xml:space="preserve">Breaches of employee rights</w:t>
             </w:r>
           </w:p>
         </w:tc>
@@ -1798,7 +1798,7 @@
                 <w:sz w:val="14"/>
                 <w:szCs w:val="14"/>
               </w:rPr>
-              <w:t xml:space="preserve">27</w:t>
+              <w:t xml:space="preserve">2</w:t>
             </w:r>
           </w:p>
         </w:tc>
@@ -1836,7 +1836,7 @@
                 <w:sz w:val="14"/>
                 <w:szCs w:val="14"/>
               </w:rPr>
-              <w:t xml:space="preserve">Breaches of employee rights</w:t>
+              <w:t xml:space="preserve">Proceedings by the Environment Superintendency</w:t>
             </w:r>
           </w:p>
         </w:tc>
@@ -1872,7 +1872,7 @@
                 <w:sz w:val="14"/>
                 <w:szCs w:val="14"/>
               </w:rPr>
-              <w:t xml:space="preserve">2</w:t>
+              <w:t xml:space="preserve">1</w:t>
             </w:r>
           </w:p>
         </w:tc>
@@ -1910,7 +1910,7 @@
                 <w:sz w:val="14"/>
                 <w:szCs w:val="14"/>
               </w:rPr>
-              <w:t xml:space="preserve">Proceedings by the Environment Superintendency</w:t>
+              <w:t xml:space="preserve">Complaints of workplace, sexual harassment and violence at work</w:t>
             </w:r>
           </w:p>
         </w:tc>
@@ -1924,80 +1924,6 @@
               <w:right w:val="none" w:color="FFFFFF" w:sz="0"/>
             </w:tcBorders>
             <w:shd w:fill="F7F8FB" w:color="auto" w:val="clear"/>
-            <w:tcMar>
-              <w:top w:type="dxa" w:w="35"/>
-              <w:left w:type="dxa" w:w="90"/>
-              <w:bottom w:type="dxa" w:w="35"/>
-              <w:right w:type="dxa" w:w="90"/>
-            </w:tcMar>
-            <w:vAlign w:val="center"/>
-          </w:tcPr>
-          <w:p>
-            <w:pPr>
-              <w:spacing w:line="216" w:lineRule="auto"/>
-              <w:jc w:val="right"/>
-            </w:pPr>
-            <w:r>
-              <w:rPr>
-                <w:rFonts w:ascii="Arial" w:cs="Arial" w:eastAsia="Arial" w:hAnsi="Arial"/>
-                <w:b w:val="false"/>
-                <w:bCs w:val="false"/>
-                <w:color w:val="1A1A1A"/>
-                <w:sz w:val="14"/>
-                <w:szCs w:val="14"/>
-              </w:rPr>
-              <w:t xml:space="preserve">1</w:t>
-            </w:r>
-          </w:p>
-        </w:tc>
-      </w:tr>
-      <w:tr>
-        <w:tc>
-          <w:tcPr>
-            <w:tcW w:type="dxa" w:w="8666"/>
-            <w:tcBorders>
-              <w:top w:val="none" w:color="FFFFFF" w:sz="0"/>
-              <w:left w:val="none" w:color="FFFFFF" w:sz="0"/>
-              <w:bottom w:val="single" w:color="D5D9E0" w:sz="4"/>
-              <w:right w:val="none" w:color="FFFFFF" w:sz="0"/>
-            </w:tcBorders>
-            <w:shd w:fill="FFFFFF" w:color="auto" w:val="clear"/>
-            <w:tcMar>
-              <w:top w:type="dxa" w:w="35"/>
-              <w:left w:type="dxa" w:w="90"/>
-              <w:bottom w:type="dxa" w:w="35"/>
-              <w:right w:type="dxa" w:w="90"/>
-            </w:tcMar>
-            <w:vAlign w:val="center"/>
-          </w:tcPr>
-          <w:p>
-            <w:pPr>
-              <w:spacing w:line="216" w:lineRule="auto"/>
-              <w:jc w:val="left"/>
-            </w:pPr>
-            <w:r>
-              <w:rPr>
-                <w:rFonts w:ascii="Arial" w:cs="Arial" w:eastAsia="Arial" w:hAnsi="Arial"/>
-                <w:b w:val="false"/>
-                <w:bCs w:val="false"/>
-                <w:color w:val="1A1A1A"/>
-                <w:sz w:val="14"/>
-                <w:szCs w:val="14"/>
-              </w:rPr>
-              <w:t xml:space="preserve">Complaints of workplace, sexual harassment and violence at work</w:t>
-            </w:r>
-          </w:p>
-        </w:tc>
-        <w:tc>
-          <w:tcPr>
-            <w:tcW w:type="dxa" w:w="2000"/>
-            <w:tcBorders>
-              <w:top w:val="none" w:color="FFFFFF" w:sz="0"/>
-              <w:left w:val="none" w:color="FFFFFF" w:sz="0"/>
-              <w:bottom w:val="single" w:color="D5D9E0" w:sz="4"/>
-              <w:right w:val="none" w:color="FFFFFF" w:sz="0"/>
-            </w:tcBorders>
-            <w:shd w:fill="FFFFFF" w:color="auto" w:val="clear"/>
             <w:tcMar>
               <w:top w:type="dxa" w:w="35"/>
               <w:left w:type="dxa" w:w="90"/>
@@ -2741,6 +2667,1611 @@
         </w:tc>
       </w:tr>
     </w:tbl>
+    <w:p>
+      <w:pPr>
+        <w:pBdr>
+          <w:bottom w:val="single" w:color="E9004B" w:sz="8" w:space="1"/>
+        </w:pBdr>
+        <w:spacing w:after="50" w:before="160"/>
+      </w:pPr>
+      <w:r>
+        <w:rPr>
+          <w:rFonts w:ascii="Arial" w:cs="Arial" w:eastAsia="Arial" w:hAnsi="Arial"/>
+          <w:b/>
+          <w:bCs/>
+          <w:color w:val="14284B"/>
+          <w:sz w:val="16"/>
+          <w:szCs w:val="16"/>
+        </w:rPr>
+        <w:t xml:space="preserve">7. ESG RISK MATRIX</w:t>
+      </w:r>
+    </w:p>
+    <w:p>
+      <w:pPr>
+        <w:spacing w:after="30" w:before="20" w:line="228" w:lineRule="auto"/>
+      </w:pPr>
+      <w:r>
+        <w:rPr>
+          <w:rFonts w:ascii="Arial" w:cs="Arial" w:eastAsia="Arial" w:hAnsi="Arial"/>
+          <w:b/>
+          <w:bCs/>
+          <w:color w:val="14284B"/>
+          <w:sz w:val="14"/>
+          <w:szCs w:val="14"/>
+        </w:rPr>
+        <w:t xml:space="preserve">Figure S5: </w:t>
+      </w:r>
+      <w:r>
+        <w:rPr>
+          <w:rFonts w:ascii="Arial" w:cs="Arial" w:eastAsia="Arial" w:hAnsi="Arial"/>
+          <w:color w:val="14284B"/>
+          <w:sz w:val="14"/>
+          <w:szCs w:val="14"/>
+        </w:rPr>
+        <w:t xml:space="preserve">ESG factor matrix and its effect on the investment case</w:t>
+      </w:r>
+    </w:p>
+    <w:p>
+      <w:pPr>
+        <w:spacing w:after="20" w:before="0" w:line="240" w:lineRule="auto"/>
+      </w:pPr>
+      <w:r>
+        <w:drawing>
+          <wp:inline distT="0" distB="0" distL="0" distR="0">
+            <wp:extent cx="6772275" cy="4619625"/>
+            <wp:effectExtent t="0" r="0" b="0" l="0"/>
+            <wp:docPr id="1" name="" descr="" title=""/>
+            <wp:cNvGraphicFramePr>
+              <a:graphicFrameLocks xmlns:a="http://schemas.openxmlformats.org/drawingml/2006/main" noChangeAspect="1"/>
+            </wp:cNvGraphicFramePr>
+            <a:graphic xmlns:a="http://schemas.openxmlformats.org/drawingml/2006/main">
+              <a:graphicData uri="http://schemas.openxmlformats.org/drawingml/2006/picture">
+                <pic:pic xmlns:pic="http://schemas.openxmlformats.org/drawingml/2006/picture">
+                  <pic:nvPicPr>
+                    <pic:cNvPr id="0" name="" descr=""/>
+                    <pic:cNvPicPr>
+                      <a:picLocks noChangeAspect="1" noChangeArrowheads="1"/>
+                    </pic:cNvPicPr>
+                  </pic:nvPicPr>
+                  <pic:blipFill>
+                    <a:blip r:embed="rId13" cstate="none"/>
+                    <a:srcRect/>
+                    <a:stretch>
+                      <a:fillRect/>
+                    </a:stretch>
+                  </pic:blipFill>
+                  <pic:spPr bwMode="auto">
+                    <a:xfrm>
+                      <a:off x="0" y="0"/>
+                      <a:ext cx="6772275" cy="4619625"/>
+                    </a:xfrm>
+                    <a:prstGeom prst="rect">
+                      <a:avLst/>
+                    </a:prstGeom>
+                  </pic:spPr>
+                </pic:pic>
+              </a:graphicData>
+            </a:graphic>
+          </wp:inline>
+        </w:drawing>
+      </w:r>
+    </w:p>
+    <w:p>
+      <w:pPr>
+        <w:spacing w:after="0" w:before="10" w:line="216" w:lineRule="auto"/>
+      </w:pPr>
+      <w:r>
+        <w:rPr>
+          <w:rFonts w:ascii="Arial" w:cs="Arial" w:eastAsia="Arial" w:hAnsi="Arial"/>
+          <w:color w:val="5F5F5F"/>
+          <w:sz w:val="11"/>
+          <w:szCs w:val="11"/>
+        </w:rPr>
+        <w:t xml:space="preserve">Materiality, time horizon, ability to absorb losses and net effect are team assessments. Framework adapted from S&amp;P Global Ratings' approach to ESG credit factors. Source: Mallplaza Annual Report 2025, Bloomberg, MSCI, Sustainalytics, S&amp;P Global; Team analysis.</w:t>
+      </w:r>
+    </w:p>
+    <w:p>
+      <w:pPr>
+        <w:pBdr>
+          <w:bottom w:val="single" w:color="E9004B" w:sz="8" w:space="1"/>
+        </w:pBdr>
+        <w:spacing w:after="50" w:before="160"/>
+      </w:pPr>
+      <w:r>
+        <w:rPr>
+          <w:rFonts w:ascii="Arial" w:cs="Arial" w:eastAsia="Arial" w:hAnsi="Arial"/>
+          <w:b/>
+          <w:bCs/>
+          <w:color w:val="14284B"/>
+          <w:sz w:val="16"/>
+          <w:szCs w:val="16"/>
+        </w:rPr>
+        <w:t xml:space="preserve">8. EXECUTIVE TEAM TRACK RECORD</w:t>
+      </w:r>
+    </w:p>
+    <w:tbl>
+      <w:tblPr>
+        <w:tblW w:type="dxa" w:w="10666"/>
+        <w:tblBorders>
+          <w:top w:val="none" w:color="FFFFFF" w:sz="0"/>
+          <w:left w:val="none" w:color="FFFFFF" w:sz="0"/>
+          <w:bottom w:val="none" w:color="FFFFFF" w:sz="0"/>
+          <w:right w:val="none" w:color="FFFFFF" w:sz="0"/>
+          <w:insideH w:val="none" w:color="FFFFFF" w:sz="0"/>
+          <w:insideV w:val="none" w:color="FFFFFF" w:sz="0"/>
+        </w:tblBorders>
+      </w:tblPr>
+      <w:tblGrid>
+        <w:gridCol w:w="1900"/>
+        <w:gridCol w:w="2300"/>
+        <w:gridCol w:w="1000"/>
+        <w:gridCol w:w="2000"/>
+        <w:gridCol w:w="3466"/>
+      </w:tblGrid>
+      <w:tr>
+        <w:trPr>
+          <w:tblHeader/>
+        </w:trPr>
+        <w:tc>
+          <w:tcPr>
+            <w:tcW w:type="dxa" w:w="1900"/>
+            <w:tcBorders>
+              <w:top w:val="none" w:color="FFFFFF" w:sz="0"/>
+              <w:left w:val="none" w:color="FFFFFF" w:sz="0"/>
+              <w:bottom w:val="none" w:color="FFFFFF" w:sz="0"/>
+              <w:right w:val="none" w:color="FFFFFF" w:sz="0"/>
+            </w:tcBorders>
+            <w:shd w:fill="14284B" w:color="auto" w:val="clear"/>
+            <w:tcMar>
+              <w:top w:type="dxa" w:w="40"/>
+              <w:left w:type="dxa" w:w="90"/>
+              <w:bottom w:type="dxa" w:w="40"/>
+              <w:right w:type="dxa" w:w="90"/>
+            </w:tcMar>
+          </w:tcPr>
+          <w:p>
+            <w:pPr>
+              <w:jc w:val="left"/>
+            </w:pPr>
+            <w:r>
+              <w:rPr>
+                <w:rFonts w:ascii="Arial" w:cs="Arial" w:eastAsia="Arial" w:hAnsi="Arial"/>
+                <w:b/>
+                <w:bCs/>
+                <w:color w:val="FFFFFF"/>
+                <w:sz w:val="14"/>
+                <w:szCs w:val="14"/>
+              </w:rPr>
+              <w:t xml:space="preserve">Name</w:t>
+            </w:r>
+          </w:p>
+        </w:tc>
+        <w:tc>
+          <w:tcPr>
+            <w:tcW w:type="dxa" w:w="2300"/>
+            <w:tcBorders>
+              <w:top w:val="none" w:color="FFFFFF" w:sz="0"/>
+              <w:left w:val="none" w:color="FFFFFF" w:sz="0"/>
+              <w:bottom w:val="none" w:color="FFFFFF" w:sz="0"/>
+              <w:right w:val="none" w:color="FFFFFF" w:sz="0"/>
+            </w:tcBorders>
+            <w:shd w:fill="14284B" w:color="auto" w:val="clear"/>
+            <w:tcMar>
+              <w:top w:type="dxa" w:w="40"/>
+              <w:left w:type="dxa" w:w="90"/>
+              <w:bottom w:type="dxa" w:w="40"/>
+              <w:right w:type="dxa" w:w="90"/>
+            </w:tcMar>
+          </w:tcPr>
+          <w:p>
+            <w:pPr>
+              <w:jc w:val="left"/>
+            </w:pPr>
+            <w:r>
+              <w:rPr>
+                <w:rFonts w:ascii="Arial" w:cs="Arial" w:eastAsia="Arial" w:hAnsi="Arial"/>
+                <w:b/>
+                <w:bCs/>
+                <w:color w:val="FFFFFF"/>
+                <w:sz w:val="14"/>
+                <w:szCs w:val="14"/>
+              </w:rPr>
+              <w:t xml:space="preserve">Role at PLAZA</w:t>
+            </w:r>
+          </w:p>
+        </w:tc>
+        <w:tc>
+          <w:tcPr>
+            <w:tcW w:type="dxa" w:w="1000"/>
+            <w:tcBorders>
+              <w:top w:val="none" w:color="FFFFFF" w:sz="0"/>
+              <w:left w:val="none" w:color="FFFFFF" w:sz="0"/>
+              <w:bottom w:val="none" w:color="FFFFFF" w:sz="0"/>
+              <w:right w:val="none" w:color="FFFFFF" w:sz="0"/>
+            </w:tcBorders>
+            <w:shd w:fill="14284B" w:color="auto" w:val="clear"/>
+            <w:tcMar>
+              <w:top w:type="dxa" w:w="40"/>
+              <w:left w:type="dxa" w:w="90"/>
+              <w:bottom w:type="dxa" w:w="40"/>
+              <w:right w:type="dxa" w:w="90"/>
+            </w:tcMar>
+          </w:tcPr>
+          <w:p>
+            <w:pPr>
+              <w:jc w:val="left"/>
+            </w:pPr>
+            <w:r>
+              <w:rPr>
+                <w:rFonts w:ascii="Arial" w:cs="Arial" w:eastAsia="Arial" w:hAnsi="Arial"/>
+                <w:b/>
+                <w:bCs/>
+                <w:color w:val="FFFFFF"/>
+                <w:sz w:val="14"/>
+                <w:szCs w:val="14"/>
+              </w:rPr>
+              <w:t xml:space="preserve">Tenure</w:t>
+            </w:r>
+          </w:p>
+        </w:tc>
+        <w:tc>
+          <w:tcPr>
+            <w:tcW w:type="dxa" w:w="2000"/>
+            <w:tcBorders>
+              <w:top w:val="none" w:color="FFFFFF" w:sz="0"/>
+              <w:left w:val="none" w:color="FFFFFF" w:sz="0"/>
+              <w:bottom w:val="none" w:color="FFFFFF" w:sz="0"/>
+              <w:right w:val="none" w:color="FFFFFF" w:sz="0"/>
+            </w:tcBorders>
+            <w:shd w:fill="14284B" w:color="auto" w:val="clear"/>
+            <w:tcMar>
+              <w:top w:type="dxa" w:w="40"/>
+              <w:left w:type="dxa" w:w="90"/>
+              <w:bottom w:type="dxa" w:w="40"/>
+              <w:right w:type="dxa" w:w="90"/>
+            </w:tcMar>
+          </w:tcPr>
+          <w:p>
+            <w:pPr>
+              <w:jc w:val="left"/>
+            </w:pPr>
+            <w:r>
+              <w:rPr>
+                <w:rFonts w:ascii="Arial" w:cs="Arial" w:eastAsia="Arial" w:hAnsi="Arial"/>
+                <w:b/>
+                <w:bCs/>
+                <w:color w:val="FFFFFF"/>
+                <w:sz w:val="14"/>
+                <w:szCs w:val="14"/>
+              </w:rPr>
+              <w:t xml:space="preserve">Previous experience</w:t>
+            </w:r>
+          </w:p>
+        </w:tc>
+        <w:tc>
+          <w:tcPr>
+            <w:tcW w:type="dxa" w:w="3466"/>
+            <w:tcBorders>
+              <w:top w:val="none" w:color="FFFFFF" w:sz="0"/>
+              <w:left w:val="none" w:color="FFFFFF" w:sz="0"/>
+              <w:bottom w:val="none" w:color="FFFFFF" w:sz="0"/>
+              <w:right w:val="none" w:color="FFFFFF" w:sz="0"/>
+            </w:tcBorders>
+            <w:shd w:fill="14284B" w:color="auto" w:val="clear"/>
+            <w:tcMar>
+              <w:top w:type="dxa" w:w="40"/>
+              <w:left w:type="dxa" w:w="90"/>
+              <w:bottom w:type="dxa" w:w="40"/>
+              <w:right w:type="dxa" w:w="90"/>
+            </w:tcMar>
+          </w:tcPr>
+          <w:p>
+            <w:pPr>
+              <w:jc w:val="left"/>
+            </w:pPr>
+            <w:r>
+              <w:rPr>
+                <w:rFonts w:ascii="Arial" w:cs="Arial" w:eastAsia="Arial" w:hAnsi="Arial"/>
+                <w:b/>
+                <w:bCs/>
+                <w:color w:val="FFFFFF"/>
+                <w:sz w:val="14"/>
+                <w:szCs w:val="14"/>
+              </w:rPr>
+              <w:t xml:space="preserve">Profile and responsibilities</w:t>
+            </w:r>
+          </w:p>
+        </w:tc>
+      </w:tr>
+      <w:tr>
+        <w:tc>
+          <w:tcPr>
+            <w:tcW w:type="dxa" w:w="1900"/>
+            <w:tcBorders>
+              <w:top w:val="none" w:color="FFFFFF" w:sz="0"/>
+              <w:left w:val="none" w:color="FFFFFF" w:sz="0"/>
+              <w:bottom w:val="single" w:color="D5D9E0" w:sz="4"/>
+              <w:right w:val="none" w:color="FFFFFF" w:sz="0"/>
+            </w:tcBorders>
+            <w:shd w:fill="F7F8FB" w:color="auto" w:val="clear"/>
+            <w:tcMar>
+              <w:top w:type="dxa" w:w="35"/>
+              <w:left w:type="dxa" w:w="90"/>
+              <w:bottom w:type="dxa" w:w="35"/>
+              <w:right w:type="dxa" w:w="90"/>
+            </w:tcMar>
+            <w:vAlign w:val="center"/>
+          </w:tcPr>
+          <w:p>
+            <w:pPr>
+              <w:spacing w:line="216" w:lineRule="auto"/>
+              <w:jc w:val="left"/>
+            </w:pPr>
+            <w:r>
+              <w:rPr>
+                <w:rFonts w:ascii="Arial" w:cs="Arial" w:eastAsia="Arial" w:hAnsi="Arial"/>
+                <w:b/>
+                <w:bCs/>
+                <w:color w:val="1A1A1A"/>
+                <w:sz w:val="14"/>
+                <w:szCs w:val="14"/>
+              </w:rPr>
+              <w:t xml:space="preserve">Pablo Pulido Sierra</w:t>
+            </w:r>
+          </w:p>
+        </w:tc>
+        <w:tc>
+          <w:tcPr>
+            <w:tcW w:type="dxa" w:w="2300"/>
+            <w:tcBorders>
+              <w:top w:val="none" w:color="FFFFFF" w:sz="0"/>
+              <w:left w:val="none" w:color="FFFFFF" w:sz="0"/>
+              <w:bottom w:val="single" w:color="D5D9E0" w:sz="4"/>
+              <w:right w:val="none" w:color="FFFFFF" w:sz="0"/>
+            </w:tcBorders>
+            <w:shd w:fill="F7F8FB" w:color="auto" w:val="clear"/>
+            <w:tcMar>
+              <w:top w:type="dxa" w:w="35"/>
+              <w:left w:type="dxa" w:w="90"/>
+              <w:bottom w:type="dxa" w:w="35"/>
+              <w:right w:type="dxa" w:w="90"/>
+            </w:tcMar>
+            <w:vAlign w:val="center"/>
+          </w:tcPr>
+          <w:p>
+            <w:pPr>
+              <w:spacing w:line="216" w:lineRule="auto"/>
+              <w:jc w:val="left"/>
+            </w:pPr>
+            <w:r>
+              <w:rPr>
+                <w:rFonts w:ascii="Arial" w:cs="Arial" w:eastAsia="Arial" w:hAnsi="Arial"/>
+                <w:b w:val="false"/>
+                <w:bCs w:val="false"/>
+                <w:color w:val="1A1A1A"/>
+                <w:sz w:val="14"/>
+                <w:szCs w:val="14"/>
+              </w:rPr>
+              <w:t xml:space="preserve">CEO (since 2026)</w:t>
+            </w:r>
+          </w:p>
+        </w:tc>
+        <w:tc>
+          <w:tcPr>
+            <w:tcW w:type="dxa" w:w="1000"/>
+            <w:tcBorders>
+              <w:top w:val="none" w:color="FFFFFF" w:sz="0"/>
+              <w:left w:val="none" w:color="FFFFFF" w:sz="0"/>
+              <w:bottom w:val="single" w:color="D5D9E0" w:sz="4"/>
+              <w:right w:val="none" w:color="FFFFFF" w:sz="0"/>
+            </w:tcBorders>
+            <w:shd w:fill="F7F8FB" w:color="auto" w:val="clear"/>
+            <w:tcMar>
+              <w:top w:type="dxa" w:w="35"/>
+              <w:left w:type="dxa" w:w="90"/>
+              <w:bottom w:type="dxa" w:w="35"/>
+              <w:right w:type="dxa" w:w="90"/>
+            </w:tcMar>
+            <w:vAlign w:val="center"/>
+          </w:tcPr>
+          <w:p>
+            <w:pPr>
+              <w:spacing w:line="216" w:lineRule="auto"/>
+              <w:jc w:val="left"/>
+            </w:pPr>
+            <w:r>
+              <w:rPr>
+                <w:rFonts w:ascii="Arial" w:cs="Arial" w:eastAsia="Arial" w:hAnsi="Arial"/>
+                <w:b w:val="false"/>
+                <w:bCs w:val="false"/>
+                <w:color w:val="1A1A1A"/>
+                <w:sz w:val="14"/>
+                <w:szCs w:val="14"/>
+              </w:rPr>
+              <w:t xml:space="preserve">10 years</w:t>
+            </w:r>
+          </w:p>
+        </w:tc>
+        <w:tc>
+          <w:tcPr>
+            <w:tcW w:type="dxa" w:w="2000"/>
+            <w:tcBorders>
+              <w:top w:val="none" w:color="FFFFFF" w:sz="0"/>
+              <w:left w:val="none" w:color="FFFFFF" w:sz="0"/>
+              <w:bottom w:val="single" w:color="D5D9E0" w:sz="4"/>
+              <w:right w:val="none" w:color="FFFFFF" w:sz="0"/>
+            </w:tcBorders>
+            <w:shd w:fill="F7F8FB" w:color="auto" w:val="clear"/>
+            <w:tcMar>
+              <w:top w:type="dxa" w:w="35"/>
+              <w:left w:type="dxa" w:w="90"/>
+              <w:bottom w:type="dxa" w:w="35"/>
+              <w:right w:type="dxa" w:w="90"/>
+            </w:tcMar>
+            <w:vAlign w:val="center"/>
+          </w:tcPr>
+          <w:p>
+            <w:pPr>
+              <w:spacing w:line="216" w:lineRule="auto"/>
+              <w:jc w:val="left"/>
+            </w:pPr>
+            <w:r>
+              <w:rPr>
+                <w:rFonts w:ascii="Arial" w:cs="Arial" w:eastAsia="Arial" w:hAnsi="Arial"/>
+                <w:b w:val="false"/>
+                <w:bCs w:val="false"/>
+                <w:color w:val="1A1A1A"/>
+                <w:sz w:val="14"/>
+                <w:szCs w:val="14"/>
+              </w:rPr>
+              <w:t xml:space="preserve">Grupo Casino, Grupo Éxito</w:t>
+            </w:r>
+          </w:p>
+        </w:tc>
+        <w:tc>
+          <w:tcPr>
+            <w:tcW w:type="dxa" w:w="3466"/>
+            <w:tcBorders>
+              <w:top w:val="none" w:color="FFFFFF" w:sz="0"/>
+              <w:left w:val="none" w:color="FFFFFF" w:sz="0"/>
+              <w:bottom w:val="single" w:color="D5D9E0" w:sz="4"/>
+              <w:right w:val="none" w:color="FFFFFF" w:sz="0"/>
+            </w:tcBorders>
+            <w:shd w:fill="F7F8FB" w:color="auto" w:val="clear"/>
+            <w:tcMar>
+              <w:top w:type="dxa" w:w="35"/>
+              <w:left w:type="dxa" w:w="90"/>
+              <w:bottom w:type="dxa" w:w="35"/>
+              <w:right w:type="dxa" w:w="90"/>
+            </w:tcMar>
+            <w:vAlign w:val="center"/>
+          </w:tcPr>
+          <w:p>
+            <w:pPr>
+              <w:spacing w:line="216" w:lineRule="auto"/>
+              <w:jc w:val="left"/>
+            </w:pPr>
+            <w:r>
+              <w:rPr>
+                <w:rFonts w:ascii="Arial" w:cs="Arial" w:eastAsia="Arial" w:hAnsi="Arial"/>
+                <w:b w:val="false"/>
+                <w:bCs w:val="false"/>
+                <w:color w:val="1A1A1A"/>
+                <w:sz w:val="14"/>
+                <w:szCs w:val="14"/>
+              </w:rPr>
+              <w:t xml:space="preserve">Commercial profile; experience in regional integrations.</w:t>
+            </w:r>
+          </w:p>
+        </w:tc>
+      </w:tr>
+      <w:tr>
+        <w:tc>
+          <w:tcPr>
+            <w:tcW w:type="dxa" w:w="1900"/>
+            <w:tcBorders>
+              <w:top w:val="none" w:color="FFFFFF" w:sz="0"/>
+              <w:left w:val="none" w:color="FFFFFF" w:sz="0"/>
+              <w:bottom w:val="single" w:color="D5D9E0" w:sz="4"/>
+              <w:right w:val="none" w:color="FFFFFF" w:sz="0"/>
+            </w:tcBorders>
+            <w:shd w:fill="FFFFFF" w:color="auto" w:val="clear"/>
+            <w:tcMar>
+              <w:top w:type="dxa" w:w="35"/>
+              <w:left w:type="dxa" w:w="90"/>
+              <w:bottom w:type="dxa" w:w="35"/>
+              <w:right w:type="dxa" w:w="90"/>
+            </w:tcMar>
+            <w:vAlign w:val="center"/>
+          </w:tcPr>
+          <w:p>
+            <w:pPr>
+              <w:spacing w:line="216" w:lineRule="auto"/>
+              <w:jc w:val="left"/>
+            </w:pPr>
+            <w:r>
+              <w:rPr>
+                <w:rFonts w:ascii="Arial" w:cs="Arial" w:eastAsia="Arial" w:hAnsi="Arial"/>
+                <w:b w:val="false"/>
+                <w:bCs w:val="false"/>
+                <w:color w:val="1A1A1A"/>
+                <w:sz w:val="14"/>
+                <w:szCs w:val="14"/>
+              </w:rPr>
+              <w:t xml:space="preserve">Fernando de Peña Iver</w:t>
+            </w:r>
+          </w:p>
+        </w:tc>
+        <w:tc>
+          <w:tcPr>
+            <w:tcW w:type="dxa" w:w="2300"/>
+            <w:tcBorders>
+              <w:top w:val="none" w:color="FFFFFF" w:sz="0"/>
+              <w:left w:val="none" w:color="FFFFFF" w:sz="0"/>
+              <w:bottom w:val="single" w:color="D5D9E0" w:sz="4"/>
+              <w:right w:val="none" w:color="FFFFFF" w:sz="0"/>
+            </w:tcBorders>
+            <w:shd w:fill="FFFFFF" w:color="auto" w:val="clear"/>
+            <w:tcMar>
+              <w:top w:type="dxa" w:w="35"/>
+              <w:left w:type="dxa" w:w="90"/>
+              <w:bottom w:type="dxa" w:w="35"/>
+              <w:right w:type="dxa" w:w="90"/>
+            </w:tcMar>
+            <w:vAlign w:val="center"/>
+          </w:tcPr>
+          <w:p>
+            <w:pPr>
+              <w:spacing w:line="216" w:lineRule="auto"/>
+              <w:jc w:val="left"/>
+            </w:pPr>
+            <w:r>
+              <w:rPr>
+                <w:rFonts w:ascii="Arial" w:cs="Arial" w:eastAsia="Arial" w:hAnsi="Arial"/>
+                <w:b w:val="false"/>
+                <w:bCs w:val="false"/>
+                <w:color w:val="1A1A1A"/>
+                <w:sz w:val="14"/>
+                <w:szCs w:val="14"/>
+              </w:rPr>
+              <w:t xml:space="preserve">CEO (until 2025)</w:t>
+            </w:r>
+          </w:p>
+        </w:tc>
+        <w:tc>
+          <w:tcPr>
+            <w:tcW w:type="dxa" w:w="1000"/>
+            <w:tcBorders>
+              <w:top w:val="none" w:color="FFFFFF" w:sz="0"/>
+              <w:left w:val="none" w:color="FFFFFF" w:sz="0"/>
+              <w:bottom w:val="single" w:color="D5D9E0" w:sz="4"/>
+              <w:right w:val="none" w:color="FFFFFF" w:sz="0"/>
+            </w:tcBorders>
+            <w:shd w:fill="FFFFFF" w:color="auto" w:val="clear"/>
+            <w:tcMar>
+              <w:top w:type="dxa" w:w="35"/>
+              <w:left w:type="dxa" w:w="90"/>
+              <w:bottom w:type="dxa" w:w="35"/>
+              <w:right w:type="dxa" w:w="90"/>
+            </w:tcMar>
+            <w:vAlign w:val="center"/>
+          </w:tcPr>
+          <w:p>
+            <w:pPr>
+              <w:spacing w:line="216" w:lineRule="auto"/>
+              <w:jc w:val="left"/>
+            </w:pPr>
+            <w:r>
+              <w:rPr>
+                <w:rFonts w:ascii="Arial" w:cs="Arial" w:eastAsia="Arial" w:hAnsi="Arial"/>
+                <w:b w:val="false"/>
+                <w:bCs w:val="false"/>
+                <w:color w:val="1A1A1A"/>
+                <w:sz w:val="14"/>
+                <w:szCs w:val="14"/>
+              </w:rPr>
+              <w:t xml:space="preserve">35 years</w:t>
+            </w:r>
+          </w:p>
+        </w:tc>
+        <w:tc>
+          <w:tcPr>
+            <w:tcW w:type="dxa" w:w="2000"/>
+            <w:tcBorders>
+              <w:top w:val="none" w:color="FFFFFF" w:sz="0"/>
+              <w:left w:val="none" w:color="FFFFFF" w:sz="0"/>
+              <w:bottom w:val="single" w:color="D5D9E0" w:sz="4"/>
+              <w:right w:val="none" w:color="FFFFFF" w:sz="0"/>
+            </w:tcBorders>
+            <w:shd w:fill="FFFFFF" w:color="auto" w:val="clear"/>
+            <w:tcMar>
+              <w:top w:type="dxa" w:w="35"/>
+              <w:left w:type="dxa" w:w="90"/>
+              <w:bottom w:type="dxa" w:w="35"/>
+              <w:right w:type="dxa" w:w="90"/>
+            </w:tcMar>
+            <w:vAlign w:val="center"/>
+          </w:tcPr>
+          <w:p>
+            <w:pPr>
+              <w:spacing w:line="216" w:lineRule="auto"/>
+              <w:jc w:val="left"/>
+            </w:pPr>
+            <w:r>
+              <w:rPr>
+                <w:rFonts w:ascii="Arial" w:cs="Arial" w:eastAsia="Arial" w:hAnsi="Arial"/>
+                <w:b w:val="false"/>
+                <w:bCs w:val="false"/>
+                <w:color w:val="1A1A1A"/>
+                <w:sz w:val="14"/>
+                <w:szCs w:val="14"/>
+              </w:rPr>
+              <w:t xml:space="preserve">Career at Mallplaza</w:t>
+            </w:r>
+          </w:p>
+        </w:tc>
+        <w:tc>
+          <w:tcPr>
+            <w:tcW w:type="dxa" w:w="3466"/>
+            <w:tcBorders>
+              <w:top w:val="none" w:color="FFFFFF" w:sz="0"/>
+              <w:left w:val="none" w:color="FFFFFF" w:sz="0"/>
+              <w:bottom w:val="single" w:color="D5D9E0" w:sz="4"/>
+              <w:right w:val="none" w:color="FFFFFF" w:sz="0"/>
+            </w:tcBorders>
+            <w:shd w:fill="FFFFFF" w:color="auto" w:val="clear"/>
+            <w:tcMar>
+              <w:top w:type="dxa" w:w="35"/>
+              <w:left w:type="dxa" w:w="90"/>
+              <w:bottom w:type="dxa" w:w="35"/>
+              <w:right w:type="dxa" w:w="90"/>
+            </w:tcMar>
+            <w:vAlign w:val="center"/>
+          </w:tcPr>
+          <w:p>
+            <w:pPr>
+              <w:spacing w:line="216" w:lineRule="auto"/>
+              <w:jc w:val="left"/>
+            </w:pPr>
+            <w:r>
+              <w:rPr>
+                <w:rFonts w:ascii="Arial" w:cs="Arial" w:eastAsia="Arial" w:hAnsi="Arial"/>
+                <w:b w:val="false"/>
+                <w:bCs w:val="false"/>
+                <w:color w:val="1A1A1A"/>
+                <w:sz w:val="14"/>
+                <w:szCs w:val="14"/>
+              </w:rPr>
+              <w:t xml:space="preserve">Led the company until 2025; extensive career in Latin American retail.</w:t>
+            </w:r>
+          </w:p>
+        </w:tc>
+      </w:tr>
+      <w:tr>
+        <w:tc>
+          <w:tcPr>
+            <w:tcW w:type="dxa" w:w="1900"/>
+            <w:tcBorders>
+              <w:top w:val="none" w:color="FFFFFF" w:sz="0"/>
+              <w:left w:val="none" w:color="FFFFFF" w:sz="0"/>
+              <w:bottom w:val="single" w:color="D5D9E0" w:sz="4"/>
+              <w:right w:val="none" w:color="FFFFFF" w:sz="0"/>
+            </w:tcBorders>
+            <w:shd w:fill="F7F8FB" w:color="auto" w:val="clear"/>
+            <w:tcMar>
+              <w:top w:type="dxa" w:w="35"/>
+              <w:left w:type="dxa" w:w="90"/>
+              <w:bottom w:type="dxa" w:w="35"/>
+              <w:right w:type="dxa" w:w="90"/>
+            </w:tcMar>
+            <w:vAlign w:val="center"/>
+          </w:tcPr>
+          <w:p>
+            <w:pPr>
+              <w:spacing w:line="216" w:lineRule="auto"/>
+              <w:jc w:val="left"/>
+            </w:pPr>
+            <w:r>
+              <w:rPr>
+                <w:rFonts w:ascii="Arial" w:cs="Arial" w:eastAsia="Arial" w:hAnsi="Arial"/>
+                <w:b w:val="false"/>
+                <w:bCs w:val="false"/>
+                <w:color w:val="1A1A1A"/>
+                <w:sz w:val="14"/>
+                <w:szCs w:val="14"/>
+              </w:rPr>
+              <w:t xml:space="preserve">Derek Schweitzer Tang</w:t>
+            </w:r>
+          </w:p>
+        </w:tc>
+        <w:tc>
+          <w:tcPr>
+            <w:tcW w:type="dxa" w:w="2300"/>
+            <w:tcBorders>
+              <w:top w:val="none" w:color="FFFFFF" w:sz="0"/>
+              <w:left w:val="none" w:color="FFFFFF" w:sz="0"/>
+              <w:bottom w:val="single" w:color="D5D9E0" w:sz="4"/>
+              <w:right w:val="none" w:color="FFFFFF" w:sz="0"/>
+            </w:tcBorders>
+            <w:shd w:fill="F7F8FB" w:color="auto" w:val="clear"/>
+            <w:tcMar>
+              <w:top w:type="dxa" w:w="35"/>
+              <w:left w:type="dxa" w:w="90"/>
+              <w:bottom w:type="dxa" w:w="35"/>
+              <w:right w:type="dxa" w:w="90"/>
+            </w:tcMar>
+            <w:vAlign w:val="center"/>
+          </w:tcPr>
+          <w:p>
+            <w:pPr>
+              <w:spacing w:line="216" w:lineRule="auto"/>
+              <w:jc w:val="left"/>
+            </w:pPr>
+            <w:r>
+              <w:rPr>
+                <w:rFonts w:ascii="Arial" w:cs="Arial" w:eastAsia="Arial" w:hAnsi="Arial"/>
+                <w:b w:val="false"/>
+                <w:bCs w:val="false"/>
+                <w:color w:val="1A1A1A"/>
+                <w:sz w:val="14"/>
+                <w:szCs w:val="14"/>
+              </w:rPr>
+              <w:t xml:space="preserve">Chief Administration and Finance Officer (CFO)</w:t>
+            </w:r>
+          </w:p>
+        </w:tc>
+        <w:tc>
+          <w:tcPr>
+            <w:tcW w:type="dxa" w:w="1000"/>
+            <w:tcBorders>
+              <w:top w:val="none" w:color="FFFFFF" w:sz="0"/>
+              <w:left w:val="none" w:color="FFFFFF" w:sz="0"/>
+              <w:bottom w:val="single" w:color="D5D9E0" w:sz="4"/>
+              <w:right w:val="none" w:color="FFFFFF" w:sz="0"/>
+            </w:tcBorders>
+            <w:shd w:fill="F7F8FB" w:color="auto" w:val="clear"/>
+            <w:tcMar>
+              <w:top w:type="dxa" w:w="35"/>
+              <w:left w:type="dxa" w:w="90"/>
+              <w:bottom w:type="dxa" w:w="35"/>
+              <w:right w:type="dxa" w:w="90"/>
+            </w:tcMar>
+            <w:vAlign w:val="center"/>
+          </w:tcPr>
+          <w:p>
+            <w:pPr>
+              <w:spacing w:line="216" w:lineRule="auto"/>
+              <w:jc w:val="left"/>
+            </w:pPr>
+            <w:r>
+              <w:rPr>
+                <w:rFonts w:ascii="Arial" w:cs="Arial" w:eastAsia="Arial" w:hAnsi="Arial"/>
+                <w:b w:val="false"/>
+                <w:bCs w:val="false"/>
+                <w:color w:val="1A1A1A"/>
+                <w:sz w:val="14"/>
+                <w:szCs w:val="14"/>
+              </w:rPr>
+              <w:t xml:space="preserve">Since 2023</w:t>
+            </w:r>
+          </w:p>
+        </w:tc>
+        <w:tc>
+          <w:tcPr>
+            <w:tcW w:type="dxa" w:w="2000"/>
+            <w:tcBorders>
+              <w:top w:val="none" w:color="FFFFFF" w:sz="0"/>
+              <w:left w:val="none" w:color="FFFFFF" w:sz="0"/>
+              <w:bottom w:val="single" w:color="D5D9E0" w:sz="4"/>
+              <w:right w:val="none" w:color="FFFFFF" w:sz="0"/>
+            </w:tcBorders>
+            <w:shd w:fill="F7F8FB" w:color="auto" w:val="clear"/>
+            <w:tcMar>
+              <w:top w:type="dxa" w:w="35"/>
+              <w:left w:type="dxa" w:w="90"/>
+              <w:bottom w:type="dxa" w:w="35"/>
+              <w:right w:type="dxa" w:w="90"/>
+            </w:tcMar>
+            <w:vAlign w:val="center"/>
+          </w:tcPr>
+          <w:p>
+            <w:pPr>
+              <w:spacing w:line="216" w:lineRule="auto"/>
+              <w:jc w:val="left"/>
+            </w:pPr>
+            <w:r>
+              <w:rPr>
+                <w:rFonts w:ascii="Arial" w:cs="Arial" w:eastAsia="Arial" w:hAnsi="Arial"/>
+                <w:b w:val="false"/>
+                <w:bCs w:val="false"/>
+                <w:color w:val="1A1A1A"/>
+                <w:sz w:val="14"/>
+                <w:szCs w:val="14"/>
+              </w:rPr>
+              <w:t xml:space="preserve">BRMalls</w:t>
+            </w:r>
+          </w:p>
+        </w:tc>
+        <w:tc>
+          <w:tcPr>
+            <w:tcW w:type="dxa" w:w="3466"/>
+            <w:tcBorders>
+              <w:top w:val="none" w:color="FFFFFF" w:sz="0"/>
+              <w:left w:val="none" w:color="FFFFFF" w:sz="0"/>
+              <w:bottom w:val="single" w:color="D5D9E0" w:sz="4"/>
+              <w:right w:val="none" w:color="FFFFFF" w:sz="0"/>
+            </w:tcBorders>
+            <w:shd w:fill="F7F8FB" w:color="auto" w:val="clear"/>
+            <w:tcMar>
+              <w:top w:type="dxa" w:w="35"/>
+              <w:left w:type="dxa" w:w="90"/>
+              <w:bottom w:type="dxa" w:w="35"/>
+              <w:right w:type="dxa" w:w="90"/>
+            </w:tcMar>
+            <w:vAlign w:val="center"/>
+          </w:tcPr>
+          <w:p>
+            <w:pPr>
+              <w:spacing w:line="216" w:lineRule="auto"/>
+              <w:jc w:val="left"/>
+            </w:pPr>
+            <w:r>
+              <w:rPr>
+                <w:rFonts w:ascii="Arial" w:cs="Arial" w:eastAsia="Arial" w:hAnsi="Arial"/>
+                <w:b w:val="false"/>
+                <w:bCs w:val="false"/>
+                <w:color w:val="1A1A1A"/>
+                <w:sz w:val="14"/>
+                <w:szCs w:val="14"/>
+              </w:rPr>
+              <w:t xml:space="preserve">International experience; his area leads the financial structure and the entry into global indices (MSCI).</w:t>
+            </w:r>
+          </w:p>
+        </w:tc>
+      </w:tr>
+      <w:tr>
+        <w:tc>
+          <w:tcPr>
+            <w:tcW w:type="dxa" w:w="1900"/>
+            <w:tcBorders>
+              <w:top w:val="none" w:color="FFFFFF" w:sz="0"/>
+              <w:left w:val="none" w:color="FFFFFF" w:sz="0"/>
+              <w:bottom w:val="single" w:color="D5D9E0" w:sz="4"/>
+              <w:right w:val="none" w:color="FFFFFF" w:sz="0"/>
+            </w:tcBorders>
+            <w:shd w:fill="FFFFFF" w:color="auto" w:val="clear"/>
+            <w:tcMar>
+              <w:top w:type="dxa" w:w="35"/>
+              <w:left w:type="dxa" w:w="90"/>
+              <w:bottom w:type="dxa" w:w="35"/>
+              <w:right w:type="dxa" w:w="90"/>
+            </w:tcMar>
+            <w:vAlign w:val="center"/>
+          </w:tcPr>
+          <w:p>
+            <w:pPr>
+              <w:spacing w:line="216" w:lineRule="auto"/>
+              <w:jc w:val="left"/>
+            </w:pPr>
+            <w:r>
+              <w:rPr>
+                <w:rFonts w:ascii="Arial" w:cs="Arial" w:eastAsia="Arial" w:hAnsi="Arial"/>
+                <w:b w:val="false"/>
+                <w:bCs w:val="false"/>
+                <w:color w:val="1A1A1A"/>
+                <w:sz w:val="14"/>
+                <w:szCs w:val="14"/>
+              </w:rPr>
+              <w:t xml:space="preserve">Carlos Honorato C.</w:t>
+            </w:r>
+          </w:p>
+        </w:tc>
+        <w:tc>
+          <w:tcPr>
+            <w:tcW w:type="dxa" w:w="2300"/>
+            <w:tcBorders>
+              <w:top w:val="none" w:color="FFFFFF" w:sz="0"/>
+              <w:left w:val="none" w:color="FFFFFF" w:sz="0"/>
+              <w:bottom w:val="single" w:color="D5D9E0" w:sz="4"/>
+              <w:right w:val="none" w:color="FFFFFF" w:sz="0"/>
+            </w:tcBorders>
+            <w:shd w:fill="FFFFFF" w:color="auto" w:val="clear"/>
+            <w:tcMar>
+              <w:top w:type="dxa" w:w="35"/>
+              <w:left w:type="dxa" w:w="90"/>
+              <w:bottom w:type="dxa" w:w="35"/>
+              <w:right w:type="dxa" w:w="90"/>
+            </w:tcMar>
+            <w:vAlign w:val="center"/>
+          </w:tcPr>
+          <w:p>
+            <w:pPr>
+              <w:spacing w:line="216" w:lineRule="auto"/>
+              <w:jc w:val="left"/>
+            </w:pPr>
+            <w:r>
+              <w:rPr>
+                <w:rFonts w:ascii="Arial" w:cs="Arial" w:eastAsia="Arial" w:hAnsi="Arial"/>
+                <w:b w:val="false"/>
+                <w:bCs w:val="false"/>
+                <w:color w:val="1A1A1A"/>
+                <w:sz w:val="14"/>
+                <w:szCs w:val="14"/>
+              </w:rPr>
+              <w:t xml:space="preserve">CTO, Chief Technology Officer</w:t>
+            </w:r>
+          </w:p>
+        </w:tc>
+        <w:tc>
+          <w:tcPr>
+            <w:tcW w:type="dxa" w:w="1000"/>
+            <w:tcBorders>
+              <w:top w:val="none" w:color="FFFFFF" w:sz="0"/>
+              <w:left w:val="none" w:color="FFFFFF" w:sz="0"/>
+              <w:bottom w:val="single" w:color="D5D9E0" w:sz="4"/>
+              <w:right w:val="none" w:color="FFFFFF" w:sz="0"/>
+            </w:tcBorders>
+            <w:shd w:fill="FFFFFF" w:color="auto" w:val="clear"/>
+            <w:tcMar>
+              <w:top w:type="dxa" w:w="35"/>
+              <w:left w:type="dxa" w:w="90"/>
+              <w:bottom w:type="dxa" w:w="35"/>
+              <w:right w:type="dxa" w:w="90"/>
+            </w:tcMar>
+            <w:vAlign w:val="center"/>
+          </w:tcPr>
+          <w:p>
+            <w:pPr>
+              <w:spacing w:line="216" w:lineRule="auto"/>
+              <w:jc w:val="left"/>
+            </w:pPr>
+            <w:r>
+              <w:rPr>
+                <w:rFonts w:ascii="Arial" w:cs="Arial" w:eastAsia="Arial" w:hAnsi="Arial"/>
+                <w:b w:val="false"/>
+                <w:bCs w:val="false"/>
+                <w:color w:val="1A1A1A"/>
+                <w:sz w:val="14"/>
+                <w:szCs w:val="14"/>
+              </w:rPr>
+              <w:t xml:space="preserve">2 years</w:t>
+            </w:r>
+          </w:p>
+        </w:tc>
+        <w:tc>
+          <w:tcPr>
+            <w:tcW w:type="dxa" w:w="2000"/>
+            <w:tcBorders>
+              <w:top w:val="none" w:color="FFFFFF" w:sz="0"/>
+              <w:left w:val="none" w:color="FFFFFF" w:sz="0"/>
+              <w:bottom w:val="single" w:color="D5D9E0" w:sz="4"/>
+              <w:right w:val="none" w:color="FFFFFF" w:sz="0"/>
+            </w:tcBorders>
+            <w:shd w:fill="FFFFFF" w:color="auto" w:val="clear"/>
+            <w:tcMar>
+              <w:top w:type="dxa" w:w="35"/>
+              <w:left w:type="dxa" w:w="90"/>
+              <w:bottom w:type="dxa" w:w="35"/>
+              <w:right w:type="dxa" w:w="90"/>
+            </w:tcMar>
+            <w:vAlign w:val="center"/>
+          </w:tcPr>
+          <w:p>
+            <w:pPr>
+              <w:spacing w:line="216" w:lineRule="auto"/>
+              <w:jc w:val="left"/>
+            </w:pPr>
+            <w:r>
+              <w:rPr>
+                <w:rFonts w:ascii="Arial" w:cs="Arial" w:eastAsia="Arial" w:hAnsi="Arial"/>
+                <w:b w:val="false"/>
+                <w:bCs w:val="false"/>
+                <w:color w:val="1A1A1A"/>
+                <w:sz w:val="14"/>
+                <w:szCs w:val="14"/>
+              </w:rPr>
+              <w:t xml:space="preserve">Ripley.com, Neoris, Alto Movup, ProChile</w:t>
+            </w:r>
+          </w:p>
+        </w:tc>
+        <w:tc>
+          <w:tcPr>
+            <w:tcW w:type="dxa" w:w="3466"/>
+            <w:tcBorders>
+              <w:top w:val="none" w:color="FFFFFF" w:sz="0"/>
+              <w:left w:val="none" w:color="FFFFFF" w:sz="0"/>
+              <w:bottom w:val="single" w:color="D5D9E0" w:sz="4"/>
+              <w:right w:val="none" w:color="FFFFFF" w:sz="0"/>
+            </w:tcBorders>
+            <w:shd w:fill="FFFFFF" w:color="auto" w:val="clear"/>
+            <w:tcMar>
+              <w:top w:type="dxa" w:w="35"/>
+              <w:left w:type="dxa" w:w="90"/>
+              <w:bottom w:type="dxa" w:w="35"/>
+              <w:right w:type="dxa" w:w="90"/>
+            </w:tcMar>
+            <w:vAlign w:val="center"/>
+          </w:tcPr>
+          <w:p>
+            <w:pPr>
+              <w:spacing w:line="216" w:lineRule="auto"/>
+              <w:jc w:val="left"/>
+            </w:pPr>
+            <w:r>
+              <w:rPr>
+                <w:rFonts w:ascii="Arial" w:cs="Arial" w:eastAsia="Arial" w:hAnsi="Arial"/>
+                <w:b w:val="false"/>
+                <w:bCs w:val="false"/>
+                <w:color w:val="1A1A1A"/>
+                <w:sz w:val="14"/>
+                <w:szCs w:val="14"/>
+              </w:rPr>
+              <w:t xml:space="preserve">Responsible for modernizing omnichannel sales and corporate cybersecurity.</w:t>
+            </w:r>
+          </w:p>
+        </w:tc>
+      </w:tr>
+      <w:tr>
+        <w:tc>
+          <w:tcPr>
+            <w:tcW w:type="dxa" w:w="1900"/>
+            <w:tcBorders>
+              <w:top w:val="none" w:color="FFFFFF" w:sz="0"/>
+              <w:left w:val="none" w:color="FFFFFF" w:sz="0"/>
+              <w:bottom w:val="single" w:color="D5D9E0" w:sz="4"/>
+              <w:right w:val="none" w:color="FFFFFF" w:sz="0"/>
+            </w:tcBorders>
+            <w:shd w:fill="F7F8FB" w:color="auto" w:val="clear"/>
+            <w:tcMar>
+              <w:top w:type="dxa" w:w="35"/>
+              <w:left w:type="dxa" w:w="90"/>
+              <w:bottom w:type="dxa" w:w="35"/>
+              <w:right w:type="dxa" w:w="90"/>
+            </w:tcMar>
+            <w:vAlign w:val="center"/>
+          </w:tcPr>
+          <w:p>
+            <w:pPr>
+              <w:spacing w:line="216" w:lineRule="auto"/>
+              <w:jc w:val="left"/>
+            </w:pPr>
+            <w:r>
+              <w:rPr>
+                <w:rFonts w:ascii="Arial" w:cs="Arial" w:eastAsia="Arial" w:hAnsi="Arial"/>
+                <w:b w:val="false"/>
+                <w:bCs w:val="false"/>
+                <w:color w:val="1A1A1A"/>
+                <w:sz w:val="14"/>
+                <w:szCs w:val="14"/>
+              </w:rPr>
+              <w:t xml:space="preserve">María Sol de Cabo</w:t>
+            </w:r>
+          </w:p>
+        </w:tc>
+        <w:tc>
+          <w:tcPr>
+            <w:tcW w:type="dxa" w:w="2300"/>
+            <w:tcBorders>
+              <w:top w:val="none" w:color="FFFFFF" w:sz="0"/>
+              <w:left w:val="none" w:color="FFFFFF" w:sz="0"/>
+              <w:bottom w:val="single" w:color="D5D9E0" w:sz="4"/>
+              <w:right w:val="none" w:color="FFFFFF" w:sz="0"/>
+            </w:tcBorders>
+            <w:shd w:fill="F7F8FB" w:color="auto" w:val="clear"/>
+            <w:tcMar>
+              <w:top w:type="dxa" w:w="35"/>
+              <w:left w:type="dxa" w:w="90"/>
+              <w:bottom w:type="dxa" w:w="35"/>
+              <w:right w:type="dxa" w:w="90"/>
+            </w:tcMar>
+            <w:vAlign w:val="center"/>
+          </w:tcPr>
+          <w:p>
+            <w:pPr>
+              <w:spacing w:line="216" w:lineRule="auto"/>
+              <w:jc w:val="left"/>
+            </w:pPr>
+            <w:r>
+              <w:rPr>
+                <w:rFonts w:ascii="Arial" w:cs="Arial" w:eastAsia="Arial" w:hAnsi="Arial"/>
+                <w:b w:val="false"/>
+                <w:bCs w:val="false"/>
+                <w:color w:val="1A1A1A"/>
+                <w:sz w:val="14"/>
+                <w:szCs w:val="14"/>
+              </w:rPr>
+              <w:t xml:space="preserve">Chief People and Culture Officer</w:t>
+            </w:r>
+          </w:p>
+        </w:tc>
+        <w:tc>
+          <w:tcPr>
+            <w:tcW w:type="dxa" w:w="1000"/>
+            <w:tcBorders>
+              <w:top w:val="none" w:color="FFFFFF" w:sz="0"/>
+              <w:left w:val="none" w:color="FFFFFF" w:sz="0"/>
+              <w:bottom w:val="single" w:color="D5D9E0" w:sz="4"/>
+              <w:right w:val="none" w:color="FFFFFF" w:sz="0"/>
+            </w:tcBorders>
+            <w:shd w:fill="F7F8FB" w:color="auto" w:val="clear"/>
+            <w:tcMar>
+              <w:top w:type="dxa" w:w="35"/>
+              <w:left w:type="dxa" w:w="90"/>
+              <w:bottom w:type="dxa" w:w="35"/>
+              <w:right w:type="dxa" w:w="90"/>
+            </w:tcMar>
+            <w:vAlign w:val="center"/>
+          </w:tcPr>
+          <w:p>
+            <w:pPr>
+              <w:spacing w:line="216" w:lineRule="auto"/>
+              <w:jc w:val="left"/>
+            </w:pPr>
+            <w:r>
+              <w:rPr>
+                <w:rFonts w:ascii="Arial" w:cs="Arial" w:eastAsia="Arial" w:hAnsi="Arial"/>
+                <w:b w:val="false"/>
+                <w:bCs w:val="false"/>
+                <w:color w:val="1A1A1A"/>
+                <w:sz w:val="14"/>
+                <w:szCs w:val="14"/>
+              </w:rPr>
+              <w:t xml:space="preserve">Since 2025</w:t>
+            </w:r>
+          </w:p>
+        </w:tc>
+        <w:tc>
+          <w:tcPr>
+            <w:tcW w:type="dxa" w:w="2000"/>
+            <w:tcBorders>
+              <w:top w:val="none" w:color="FFFFFF" w:sz="0"/>
+              <w:left w:val="none" w:color="FFFFFF" w:sz="0"/>
+              <w:bottom w:val="single" w:color="D5D9E0" w:sz="4"/>
+              <w:right w:val="none" w:color="FFFFFF" w:sz="0"/>
+            </w:tcBorders>
+            <w:shd w:fill="F7F8FB" w:color="auto" w:val="clear"/>
+            <w:tcMar>
+              <w:top w:type="dxa" w:w="35"/>
+              <w:left w:type="dxa" w:w="90"/>
+              <w:bottom w:type="dxa" w:w="35"/>
+              <w:right w:type="dxa" w:w="90"/>
+            </w:tcMar>
+            <w:vAlign w:val="center"/>
+          </w:tcPr>
+          <w:p>
+            <w:pPr>
+              <w:spacing w:line="216" w:lineRule="auto"/>
+              <w:jc w:val="left"/>
+            </w:pPr>
+            <w:r>
+              <w:rPr>
+                <w:rFonts w:ascii="Arial" w:cs="Arial" w:eastAsia="Arial" w:hAnsi="Arial"/>
+                <w:b w:val="false"/>
+                <w:bCs w:val="false"/>
+                <w:color w:val="1A1A1A"/>
+                <w:sz w:val="14"/>
+                <w:szCs w:val="14"/>
+              </w:rPr>
+              <w:t xml:space="preserve">Betterfly</w:t>
+            </w:r>
+          </w:p>
+        </w:tc>
+        <w:tc>
+          <w:tcPr>
+            <w:tcW w:type="dxa" w:w="3466"/>
+            <w:tcBorders>
+              <w:top w:val="none" w:color="FFFFFF" w:sz="0"/>
+              <w:left w:val="none" w:color="FFFFFF" w:sz="0"/>
+              <w:bottom w:val="single" w:color="D5D9E0" w:sz="4"/>
+              <w:right w:val="none" w:color="FFFFFF" w:sz="0"/>
+            </w:tcBorders>
+            <w:shd w:fill="F7F8FB" w:color="auto" w:val="clear"/>
+            <w:tcMar>
+              <w:top w:type="dxa" w:w="35"/>
+              <w:left w:type="dxa" w:w="90"/>
+              <w:bottom w:type="dxa" w:w="35"/>
+              <w:right w:type="dxa" w:w="90"/>
+            </w:tcMar>
+            <w:vAlign w:val="center"/>
+          </w:tcPr>
+          <w:p>
+            <w:pPr>
+              <w:spacing w:line="216" w:lineRule="auto"/>
+              <w:jc w:val="left"/>
+            </w:pPr>
+            <w:r>
+              <w:rPr>
+                <w:rFonts w:ascii="Arial" w:cs="Arial" w:eastAsia="Arial" w:hAnsi="Arial"/>
+                <w:b w:val="false"/>
+                <w:bCs w:val="false"/>
+                <w:color w:val="1A1A1A"/>
+                <w:sz w:val="14"/>
+                <w:szCs w:val="14"/>
+              </w:rPr>
+              <w:t xml:space="preserve">Over 20 years of international experience in talent management.</w:t>
+            </w:r>
+          </w:p>
+        </w:tc>
+      </w:tr>
+      <w:tr>
+        <w:tc>
+          <w:tcPr>
+            <w:tcW w:type="dxa" w:w="1900"/>
+            <w:tcBorders>
+              <w:top w:val="none" w:color="FFFFFF" w:sz="0"/>
+              <w:left w:val="none" w:color="FFFFFF" w:sz="0"/>
+              <w:bottom w:val="single" w:color="D5D9E0" w:sz="4"/>
+              <w:right w:val="none" w:color="FFFFFF" w:sz="0"/>
+            </w:tcBorders>
+            <w:shd w:fill="FFFFFF" w:color="auto" w:val="clear"/>
+            <w:tcMar>
+              <w:top w:type="dxa" w:w="35"/>
+              <w:left w:type="dxa" w:w="90"/>
+              <w:bottom w:type="dxa" w:w="35"/>
+              <w:right w:type="dxa" w:w="90"/>
+            </w:tcMar>
+            <w:vAlign w:val="center"/>
+          </w:tcPr>
+          <w:p>
+            <w:pPr>
+              <w:spacing w:line="216" w:lineRule="auto"/>
+              <w:jc w:val="left"/>
+            </w:pPr>
+            <w:r>
+              <w:rPr>
+                <w:rFonts w:ascii="Arial" w:cs="Arial" w:eastAsia="Arial" w:hAnsi="Arial"/>
+                <w:b w:val="false"/>
+                <w:bCs w:val="false"/>
+                <w:color w:val="1A1A1A"/>
+                <w:sz w:val="14"/>
+                <w:szCs w:val="14"/>
+              </w:rPr>
+              <w:t xml:space="preserve">Oscar Munizaga Delfín</w:t>
+            </w:r>
+          </w:p>
+        </w:tc>
+        <w:tc>
+          <w:tcPr>
+            <w:tcW w:type="dxa" w:w="2300"/>
+            <w:tcBorders>
+              <w:top w:val="none" w:color="FFFFFF" w:sz="0"/>
+              <w:left w:val="none" w:color="FFFFFF" w:sz="0"/>
+              <w:bottom w:val="single" w:color="D5D9E0" w:sz="4"/>
+              <w:right w:val="none" w:color="FFFFFF" w:sz="0"/>
+            </w:tcBorders>
+            <w:shd w:fill="FFFFFF" w:color="auto" w:val="clear"/>
+            <w:tcMar>
+              <w:top w:type="dxa" w:w="35"/>
+              <w:left w:type="dxa" w:w="90"/>
+              <w:bottom w:type="dxa" w:w="35"/>
+              <w:right w:type="dxa" w:w="90"/>
+            </w:tcMar>
+            <w:vAlign w:val="center"/>
+          </w:tcPr>
+          <w:p>
+            <w:pPr>
+              <w:spacing w:line="216" w:lineRule="auto"/>
+              <w:jc w:val="left"/>
+            </w:pPr>
+            <w:r>
+              <w:rPr>
+                <w:rFonts w:ascii="Arial" w:cs="Arial" w:eastAsia="Arial" w:hAnsi="Arial"/>
+                <w:b w:val="false"/>
+                <w:bCs w:val="false"/>
+                <w:color w:val="1A1A1A"/>
+                <w:sz w:val="14"/>
+                <w:szCs w:val="14"/>
+              </w:rPr>
+              <w:t xml:space="preserve">Chief Development and Business Officer</w:t>
+            </w:r>
+          </w:p>
+        </w:tc>
+        <w:tc>
+          <w:tcPr>
+            <w:tcW w:type="dxa" w:w="1000"/>
+            <w:tcBorders>
+              <w:top w:val="none" w:color="FFFFFF" w:sz="0"/>
+              <w:left w:val="none" w:color="FFFFFF" w:sz="0"/>
+              <w:bottom w:val="single" w:color="D5D9E0" w:sz="4"/>
+              <w:right w:val="none" w:color="FFFFFF" w:sz="0"/>
+            </w:tcBorders>
+            <w:shd w:fill="FFFFFF" w:color="auto" w:val="clear"/>
+            <w:tcMar>
+              <w:top w:type="dxa" w:w="35"/>
+              <w:left w:type="dxa" w:w="90"/>
+              <w:bottom w:type="dxa" w:w="35"/>
+              <w:right w:type="dxa" w:w="90"/>
+            </w:tcMar>
+            <w:vAlign w:val="center"/>
+          </w:tcPr>
+          <w:p>
+            <w:pPr>
+              <w:spacing w:line="216" w:lineRule="auto"/>
+              <w:jc w:val="left"/>
+            </w:pPr>
+            <w:r>
+              <w:rPr>
+                <w:rFonts w:ascii="Arial" w:cs="Arial" w:eastAsia="Arial" w:hAnsi="Arial"/>
+                <w:b w:val="false"/>
+                <w:bCs w:val="false"/>
+                <w:color w:val="1A1A1A"/>
+                <w:sz w:val="14"/>
+                <w:szCs w:val="14"/>
+              </w:rPr>
+              <w:t xml:space="preserve">34 years</w:t>
+            </w:r>
+          </w:p>
+        </w:tc>
+        <w:tc>
+          <w:tcPr>
+            <w:tcW w:type="dxa" w:w="2000"/>
+            <w:tcBorders>
+              <w:top w:val="none" w:color="FFFFFF" w:sz="0"/>
+              <w:left w:val="none" w:color="FFFFFF" w:sz="0"/>
+              <w:bottom w:val="single" w:color="D5D9E0" w:sz="4"/>
+              <w:right w:val="none" w:color="FFFFFF" w:sz="0"/>
+            </w:tcBorders>
+            <w:shd w:fill="FFFFFF" w:color="auto" w:val="clear"/>
+            <w:tcMar>
+              <w:top w:type="dxa" w:w="35"/>
+              <w:left w:type="dxa" w:w="90"/>
+              <w:bottom w:type="dxa" w:w="35"/>
+              <w:right w:type="dxa" w:w="90"/>
+            </w:tcMar>
+            <w:vAlign w:val="center"/>
+          </w:tcPr>
+          <w:p>
+            <w:pPr>
+              <w:spacing w:line="216" w:lineRule="auto"/>
+              <w:jc w:val="left"/>
+            </w:pPr>
+            <w:r>
+              <w:rPr>
+                <w:rFonts w:ascii="Arial" w:cs="Arial" w:eastAsia="Arial" w:hAnsi="Arial"/>
+                <w:b w:val="false"/>
+                <w:bCs w:val="false"/>
+                <w:color w:val="1A1A1A"/>
+                <w:sz w:val="14"/>
+                <w:szCs w:val="14"/>
+              </w:rPr>
+              <w:t xml:space="preserve">Career at Mallplaza</w:t>
+            </w:r>
+          </w:p>
+        </w:tc>
+        <w:tc>
+          <w:tcPr>
+            <w:tcW w:type="dxa" w:w="3466"/>
+            <w:tcBorders>
+              <w:top w:val="none" w:color="FFFFFF" w:sz="0"/>
+              <w:left w:val="none" w:color="FFFFFF" w:sz="0"/>
+              <w:bottom w:val="single" w:color="D5D9E0" w:sz="4"/>
+              <w:right w:val="none" w:color="FFFFFF" w:sz="0"/>
+            </w:tcBorders>
+            <w:shd w:fill="FFFFFF" w:color="auto" w:val="clear"/>
+            <w:tcMar>
+              <w:top w:type="dxa" w:w="35"/>
+              <w:left w:type="dxa" w:w="90"/>
+              <w:bottom w:type="dxa" w:w="35"/>
+              <w:right w:type="dxa" w:w="90"/>
+            </w:tcMar>
+            <w:vAlign w:val="center"/>
+          </w:tcPr>
+          <w:p>
+            <w:pPr>
+              <w:spacing w:line="216" w:lineRule="auto"/>
+              <w:jc w:val="left"/>
+            </w:pPr>
+            <w:r>
+              <w:rPr>
+                <w:rFonts w:ascii="Arial" w:cs="Arial" w:eastAsia="Arial" w:hAnsi="Arial"/>
+                <w:b w:val="false"/>
+                <w:bCs w:val="false"/>
+                <w:color w:val="1A1A1A"/>
+                <w:sz w:val="14"/>
+                <w:szCs w:val="14"/>
+              </w:rPr>
+              <w:t xml:space="preserve">Responsible for growth through M&amp;A and greenfield developments.</w:t>
+            </w:r>
+          </w:p>
+        </w:tc>
+      </w:tr>
+      <w:tr>
+        <w:tc>
+          <w:tcPr>
+            <w:tcW w:type="dxa" w:w="1900"/>
+            <w:tcBorders>
+              <w:top w:val="none" w:color="FFFFFF" w:sz="0"/>
+              <w:left w:val="none" w:color="FFFFFF" w:sz="0"/>
+              <w:bottom w:val="single" w:color="D5D9E0" w:sz="4"/>
+              <w:right w:val="none" w:color="FFFFFF" w:sz="0"/>
+            </w:tcBorders>
+            <w:shd w:fill="F7F8FB" w:color="auto" w:val="clear"/>
+            <w:tcMar>
+              <w:top w:type="dxa" w:w="35"/>
+              <w:left w:type="dxa" w:w="90"/>
+              <w:bottom w:type="dxa" w:w="35"/>
+              <w:right w:type="dxa" w:w="90"/>
+            </w:tcMar>
+            <w:vAlign w:val="center"/>
+          </w:tcPr>
+          <w:p>
+            <w:pPr>
+              <w:spacing w:line="216" w:lineRule="auto"/>
+              <w:jc w:val="left"/>
+            </w:pPr>
+            <w:r>
+              <w:rPr>
+                <w:rFonts w:ascii="Arial" w:cs="Arial" w:eastAsia="Arial" w:hAnsi="Arial"/>
+                <w:b w:val="false"/>
+                <w:bCs w:val="false"/>
+                <w:color w:val="1A1A1A"/>
+                <w:sz w:val="14"/>
+                <w:szCs w:val="14"/>
+              </w:rPr>
+              <w:t xml:space="preserve">Luis Hernán Silva</w:t>
+            </w:r>
+          </w:p>
+        </w:tc>
+        <w:tc>
+          <w:tcPr>
+            <w:tcW w:type="dxa" w:w="2300"/>
+            <w:tcBorders>
+              <w:top w:val="none" w:color="FFFFFF" w:sz="0"/>
+              <w:left w:val="none" w:color="FFFFFF" w:sz="0"/>
+              <w:bottom w:val="single" w:color="D5D9E0" w:sz="4"/>
+              <w:right w:val="none" w:color="FFFFFF" w:sz="0"/>
+            </w:tcBorders>
+            <w:shd w:fill="F7F8FB" w:color="auto" w:val="clear"/>
+            <w:tcMar>
+              <w:top w:type="dxa" w:w="35"/>
+              <w:left w:type="dxa" w:w="90"/>
+              <w:bottom w:type="dxa" w:w="35"/>
+              <w:right w:type="dxa" w:w="90"/>
+            </w:tcMar>
+            <w:vAlign w:val="center"/>
+          </w:tcPr>
+          <w:p>
+            <w:pPr>
+              <w:spacing w:line="216" w:lineRule="auto"/>
+              <w:jc w:val="left"/>
+            </w:pPr>
+            <w:r>
+              <w:rPr>
+                <w:rFonts w:ascii="Arial" w:cs="Arial" w:eastAsia="Arial" w:hAnsi="Arial"/>
+                <w:b w:val="false"/>
+                <w:bCs w:val="false"/>
+                <w:color w:val="1A1A1A"/>
+                <w:sz w:val="14"/>
+                <w:szCs w:val="14"/>
+              </w:rPr>
+              <w:t xml:space="preserve">Chief Legal, Risk and Compliance Officer</w:t>
+            </w:r>
+          </w:p>
+        </w:tc>
+        <w:tc>
+          <w:tcPr>
+            <w:tcW w:type="dxa" w:w="1000"/>
+            <w:tcBorders>
+              <w:top w:val="none" w:color="FFFFFF" w:sz="0"/>
+              <w:left w:val="none" w:color="FFFFFF" w:sz="0"/>
+              <w:bottom w:val="single" w:color="D5D9E0" w:sz="4"/>
+              <w:right w:val="none" w:color="FFFFFF" w:sz="0"/>
+            </w:tcBorders>
+            <w:shd w:fill="F7F8FB" w:color="auto" w:val="clear"/>
+            <w:tcMar>
+              <w:top w:type="dxa" w:w="35"/>
+              <w:left w:type="dxa" w:w="90"/>
+              <w:bottom w:type="dxa" w:w="35"/>
+              <w:right w:type="dxa" w:w="90"/>
+            </w:tcMar>
+            <w:vAlign w:val="center"/>
+          </w:tcPr>
+          <w:p>
+            <w:pPr>
+              <w:spacing w:line="216" w:lineRule="auto"/>
+              <w:jc w:val="left"/>
+            </w:pPr>
+            <w:r>
+              <w:rPr>
+                <w:rFonts w:ascii="Arial" w:cs="Arial" w:eastAsia="Arial" w:hAnsi="Arial"/>
+                <w:b w:val="false"/>
+                <w:bCs w:val="false"/>
+                <w:color w:val="1A1A1A"/>
+                <w:sz w:val="14"/>
+                <w:szCs w:val="14"/>
+              </w:rPr>
+              <w:t xml:space="preserve">27 years</w:t>
+            </w:r>
+          </w:p>
+        </w:tc>
+        <w:tc>
+          <w:tcPr>
+            <w:tcW w:type="dxa" w:w="2000"/>
+            <w:tcBorders>
+              <w:top w:val="none" w:color="FFFFFF" w:sz="0"/>
+              <w:left w:val="none" w:color="FFFFFF" w:sz="0"/>
+              <w:bottom w:val="single" w:color="D5D9E0" w:sz="4"/>
+              <w:right w:val="none" w:color="FFFFFF" w:sz="0"/>
+            </w:tcBorders>
+            <w:shd w:fill="F7F8FB" w:color="auto" w:val="clear"/>
+            <w:tcMar>
+              <w:top w:type="dxa" w:w="35"/>
+              <w:left w:type="dxa" w:w="90"/>
+              <w:bottom w:type="dxa" w:w="35"/>
+              <w:right w:type="dxa" w:w="90"/>
+            </w:tcMar>
+            <w:vAlign w:val="center"/>
+          </w:tcPr>
+          <w:p>
+            <w:pPr>
+              <w:spacing w:line="216" w:lineRule="auto"/>
+              <w:jc w:val="left"/>
+            </w:pPr>
+            <w:r>
+              <w:rPr>
+                <w:rFonts w:ascii="Arial" w:cs="Arial" w:eastAsia="Arial" w:hAnsi="Arial"/>
+                <w:b w:val="false"/>
+                <w:bCs w:val="false"/>
+                <w:color w:val="1A1A1A"/>
+                <w:sz w:val="14"/>
+                <w:szCs w:val="14"/>
+              </w:rPr>
+              <w:t xml:space="preserve">Career at Mallplaza</w:t>
+            </w:r>
+          </w:p>
+        </w:tc>
+        <w:tc>
+          <w:tcPr>
+            <w:tcW w:type="dxa" w:w="3466"/>
+            <w:tcBorders>
+              <w:top w:val="none" w:color="FFFFFF" w:sz="0"/>
+              <w:left w:val="none" w:color="FFFFFF" w:sz="0"/>
+              <w:bottom w:val="single" w:color="D5D9E0" w:sz="4"/>
+              <w:right w:val="none" w:color="FFFFFF" w:sz="0"/>
+            </w:tcBorders>
+            <w:shd w:fill="F7F8FB" w:color="auto" w:val="clear"/>
+            <w:tcMar>
+              <w:top w:type="dxa" w:w="35"/>
+              <w:left w:type="dxa" w:w="90"/>
+              <w:bottom w:type="dxa" w:w="35"/>
+              <w:right w:type="dxa" w:w="90"/>
+            </w:tcMar>
+            <w:vAlign w:val="center"/>
+          </w:tcPr>
+          <w:p>
+            <w:pPr>
+              <w:spacing w:line="216" w:lineRule="auto"/>
+              <w:jc w:val="left"/>
+            </w:pPr>
+            <w:r>
+              <w:rPr>
+                <w:rFonts w:ascii="Arial" w:cs="Arial" w:eastAsia="Arial" w:hAnsi="Arial"/>
+                <w:b w:val="false"/>
+                <w:bCs w:val="false"/>
+                <w:color w:val="1A1A1A"/>
+                <w:sz w:val="14"/>
+                <w:szCs w:val="14"/>
+              </w:rPr>
+              <w:t xml:space="preserve">Responsible for corporate legal affairs and risk and compliance management.</w:t>
+            </w:r>
+          </w:p>
+        </w:tc>
+      </w:tr>
+    </w:tbl>
+    <w:p>
+      <w:pPr>
+        <w:spacing w:after="0" w:before="10" w:line="216" w:lineRule="auto"/>
+      </w:pPr>
+      <w:r>
+        <w:rPr>
+          <w:rFonts w:ascii="Arial" w:cs="Arial" w:eastAsia="Arial" w:hAnsi="Arial"/>
+          <w:color w:val="5F5F5F"/>
+          <w:sz w:val="11"/>
+          <w:szCs w:val="11"/>
+        </w:rPr>
+        <w:t xml:space="preserve">Source: company public information; Team notes (track record).</w:t>
+      </w:r>
+    </w:p>
     <w:sectPr>
       <w:headerReference w:type="default" r:id="rId7"/>
       <w:footerReference w:type="default" r:id="rId8"/>

</xml_diff>